<commit_message>
Actualiza sílabo Word y agrega tratamiento de valores nulos
- Silabo_Curso_R_CIMAT.docx: regenerado con las 13 sesiones (26h),
  incluyendo la sección 'Configuración del entorno' (instalación de R/
  RStudio, tour de la interfaz) como preparación previa al curso.
- Sesión 2c / capítulo 2c: se agrega 'Tratamiento de valores nulos'
  (is.na, complete.cases, na.omit, imputación) entre CSV y las
  operaciones por fila/columna, con su parte correspondiente en el
  ejercicio.
- docs/silabo.md: fila de la sesión 2c actualizada para incluir el
  nuevo tema.
</commit_message>
<xml_diff>
--- a/docs/Silabo_Curso_R_CIMAT.docx
+++ b/docs/Silabo_Curso_R_CIMAT.docx
@@ -45,7 +45,7 @@
           <w:sz w:val="22"/>
           <w:szCs w:val="22"/>
         </w:rPr>
-        <w:t xml:space="preserve">Duración: 10 sesiones · 2 horas cada una (20 horas totales) · 5 días, 2 sesiones al día</w:t>
+        <w:t xml:space="preserve">Duración: 13 sesiones · 2 horas cada una (26 horas totales)</w:t>
       </w:r>
     </w:p>
     <w:p>
@@ -65,7 +65,7 @@
         <w:rPr>
           <w:rFonts w:ascii="Calibri" w:cs="Calibri" w:eastAsia="Calibri" w:hAnsi="Calibri"/>
         </w:rPr>
-        <w:t xml:space="preserve">Curso intensivo de nivelación dirigido a estudiantes de nuevo ingreso a la maestría del CIMAT Aguascalientes, previo al curso de Modelación Estadística. Está diseñado para alumnos que ya saben programar en algún otro lenguaje (Python, C/C++, MATLAB, etc.), por lo que no se dedica tiempo a conceptos generales de programación: el curso va directo a la sintaxis y los idiomas propios de R, y dedica la mayor parte del tiempo a su aplicación en modelación estadística.</w:t>
+        <w:t xml:space="preserve">Curso intensivo de nivelación dirigido a estudiantes de nuevo ingreso a la maestría del CIMAT Aguascalientes, previo al curso de Modelación Estadística. La columna vertebral del curso (sesión 1 en adelante) está diseñada para alumnos que ya saben programar en algún otro lenguaje (Python, C/C++, MATLAB, etc.), por lo que no se dedica tiempo a conceptos generales de programación: va directo a la sintaxis y los idiomas propios de R, y dedica la mayor parte del tiempo a su aplicación en modelación estadística. Las sesiones 0, 2b y 2c cubren fundamentos de R desde cero (aritmética, matrices, data frames en base R) para quien las necesite como punto de partida o repaso.</w:t>
       </w:r>
     </w:p>
     <w:p>
@@ -90,7 +90,7 @@
         <w:rPr>
           <w:rFonts w:ascii="Calibri" w:cs="Calibri" w:eastAsia="Calibri" w:hAnsi="Calibri"/>
         </w:rPr>
-        <w:t xml:space="preserve">Traducir el conocimiento de programación previo a los idiomas propios de R (vectorización, data frames, tidyverse).</w:t>
+        <w:t xml:space="preserve">Traducir el conocimiento de programación previo a los idiomas propios de R (vectorización, matrices, data frames, tidyverse).</w:t>
       </w:r>
     </w:p>
     <w:p>
@@ -106,7 +106,7 @@
         <w:rPr>
           <w:rFonts w:ascii="Calibri" w:cs="Calibri" w:eastAsia="Calibri" w:hAnsi="Calibri"/>
         </w:rPr>
-        <w:t xml:space="preserve">Manipular, limpiar y visualizar datos de forma eficiente con el ecosistema tidyverse.</w:t>
+        <w:t xml:space="preserve">Manipular, limpiar y visualizar datos de forma eficiente, tanto con base R como con el ecosistema tidyverse.</w:t>
       </w:r>
     </w:p>
     <w:p>
@@ -174,7 +174,7 @@
         <w:rPr>
           <w:rFonts w:ascii="Calibri" w:cs="Calibri" w:eastAsia="Calibri" w:hAnsi="Calibri"/>
         </w:rPr>
-        <w:t xml:space="preserve">Alumnos de nuevo ingreso a la maestría del CIMAT Aguascalientes, con experiencia previa en programación en cualquier lenguaje y sin necesariamente experiencia previa en R.</w:t>
+        <w:t xml:space="preserve">Alumnos de nuevo ingreso a la maestría del CIMAT Aguascalientes. Las sesiones 1 en adelante asumen experiencia previa en programación en cualquier lenguaje, sin necesariamente experiencia previa en R; las sesiones 0, 2b y 2c no asumen ningún conocimiento previo de R.</w:t>
       </w:r>
     </w:p>
     <w:p>
@@ -183,7 +183,18 @@
         <w:spacing w:after="150" w:before="300"/>
       </w:pPr>
       <w:r>
-        <w:t xml:space="preserve">Metodología</w:t>
+        <w:t xml:space="preserve">Configuración del entorno</w:t>
+      </w:r>
+    </w:p>
+    <w:p>
+      <w:pPr>
+        <w:spacing w:after="100"/>
+      </w:pPr>
+      <w:r>
+        <w:rPr>
+          <w:rFonts w:ascii="Calibri" w:cs="Calibri" w:eastAsia="Calibri" w:hAnsi="Calibri"/>
+        </w:rPr>
+        <w:t xml:space="preserve">Preparación previa al curso, fuera de las horas de sesión:</w:t>
       </w:r>
     </w:p>
     <w:p>
@@ -199,7 +210,7 @@
         <w:rPr>
           <w:rFonts w:ascii="Calibri" w:cs="Calibri" w:eastAsia="Calibri" w:hAnsi="Calibri"/>
         </w:rPr>
-        <w:t xml:space="preserve">10 sesiones de 2 horas, repartidas en 5 días (mañana y tarde): exposición breve de conceptos + práctica guiada en RStudio/Posit.</w:t>
+        <w:t xml:space="preserve">Instalación de R y RStudio.</w:t>
       </w:r>
     </w:p>
     <w:p>
@@ -215,7 +226,16 @@
         <w:rPr>
           <w:rFonts w:ascii="Calibri" w:cs="Calibri" w:eastAsia="Calibri" w:hAnsi="Calibri"/>
         </w:rPr>
-        <w:t xml:space="preserve">Aprendizaje por comparación con otros lenguajes ("esto es como X, pero...").</w:t>
+        <w:t xml:space="preserve">Introducción a la herramienta RStudio.</w:t>
+      </w:r>
+    </w:p>
+    <w:p>
+      <w:pPr>
+        <w:pStyle w:val="Heading1"/>
+        <w:spacing w:after="150" w:before="300"/>
+      </w:pPr>
+      <w:r>
+        <w:t xml:space="preserve">Metodología</w:t>
       </w:r>
     </w:p>
     <w:p>
@@ -231,7 +251,39 @@
         <w:rPr>
           <w:rFonts w:ascii="Calibri" w:cs="Calibri" w:eastAsia="Calibri" w:hAnsi="Calibri"/>
         </w:rPr>
-        <w:t xml:space="preserve">Ejercicios cortos al final de cada sesión y un mini-proyecto integrador en la última sesión.</w:t>
+        <w:t xml:space="preserve">13 sesiones de 2 horas: exposición breve de conceptos + práctica guiada en RStudio/Posit. Pensado originalmente como 2 sesiones por día (mañana y tarde).</w:t>
+      </w:r>
+    </w:p>
+    <w:p>
+      <w:pPr>
+        <w:pStyle w:val="ListParagraph"/>
+        <w:numPr>
+          <w:ilvl w:val="0"/>
+          <w:numId w:val="2"/>
+        </w:numPr>
+        <w:spacing w:after="60"/>
+      </w:pPr>
+      <w:r>
+        <w:rPr>
+          <w:rFonts w:ascii="Calibri" w:cs="Calibri" w:eastAsia="Calibri" w:hAnsi="Calibri"/>
+        </w:rPr>
+        <w:t xml:space="preserve">Aprendizaje por comparación con otros lenguajes ("esto es como X, pero...").</w:t>
+      </w:r>
+    </w:p>
+    <w:p>
+      <w:pPr>
+        <w:pStyle w:val="ListParagraph"/>
+        <w:numPr>
+          <w:ilvl w:val="0"/>
+          <w:numId w:val="2"/>
+        </w:numPr>
+        <w:spacing w:after="60"/>
+      </w:pPr>
+      <w:r>
+        <w:rPr>
+          <w:rFonts w:ascii="Calibri" w:cs="Calibri" w:eastAsia="Calibri" w:hAnsi="Calibri"/>
+        </w:rPr>
+        <w:t xml:space="preserve">Ejercicios al final de cada sesión (algunos con solución incluida) y un mini-proyecto integrador en la última sesión.</w:t>
       </w:r>
     </w:p>
     <w:p>
@@ -347,31 +399,11 @@
                 <w:rFonts w:ascii="Calibri" w:cs="Calibri" w:eastAsia="Calibri" w:hAnsi="Calibri"/>
                 <w:b/>
                 <w:bCs/>
-                <w:i w:val="false"/>
-                <w:iCs w:val="false"/>
-                <w:color w:val="1F3864"/>
+                <w:color w:val="1C7293"/>
                 <w:sz w:val="21"/>
                 <w:szCs w:val="21"/>
               </w:rPr>
-              <w:t xml:space="preserve">Sesión 1</w:t>
-            </w:r>
-          </w:p>
-          <w:p>
-            <w:pPr>
-              <w:spacing w:after="20"/>
-            </w:pPr>
-            <w:r>
-              <w:rPr>
-                <w:rFonts w:ascii="Calibri" w:cs="Calibri" w:eastAsia="Calibri" w:hAnsi="Calibri"/>
-                <w:b w:val="false"/>
-                <w:bCs w:val="false"/>
-                <w:i/>
-                <w:iCs/>
-                <w:color w:val="6B7A85"/>
-                <w:sz w:val="17"/>
-                <w:szCs w:val="17"/>
-              </w:rPr>
-              <w:t xml:space="preserve">Día 1 · mañana</w:t>
+              <w:t xml:space="preserve">Sesión 0</w:t>
             </w:r>
           </w:p>
           <w:p>
@@ -383,13 +415,11 @@
                 <w:rFonts w:ascii="Calibri" w:cs="Calibri" w:eastAsia="Calibri" w:hAnsi="Calibri"/>
                 <w:b/>
                 <w:bCs/>
-                <w:i w:val="false"/>
-                <w:iCs w:val="false"/>
                 <w:color w:val="1F3864"/>
-                <w:sz w:val="17"/>
-                <w:szCs w:val="17"/>
-              </w:rPr>
-              <w:t xml:space="preserve">Vectores y tipos de datos</w:t>
+                <w:sz w:val="18"/>
+                <w:szCs w:val="18"/>
+              </w:rPr>
+              <w:t xml:space="preserve">Introducción a R</w:t>
             </w:r>
           </w:p>
         </w:tc>
@@ -413,33 +443,85 @@
                 <w:sz w:val="20"/>
                 <w:szCs w:val="20"/>
               </w:rPr>
-              <w:t xml:space="preserve">• Consola, scripts, RStudio/Posit y proyectos (.Rproj)</w:t>
-            </w:r>
-          </w:p>
-          <w:p>
-            <w:pPr>
-              <w:spacing w:after="40"/>
-            </w:pPr>
-            <w:r>
-              <w:rPr>
-                <w:rFonts w:ascii="Calibri" w:cs="Calibri" w:eastAsia="Calibri" w:hAnsi="Calibri"/>
-                <w:sz w:val="20"/>
-                <w:szCs w:val="20"/>
-              </w:rPr>
-              <w:t xml:space="preserve">• Tipos de datos y vectores; indexación desde 1 y reciclaje</w:t>
-            </w:r>
-          </w:p>
-          <w:p>
-            <w:pPr>
-              <w:spacing w:after="40"/>
-            </w:pPr>
-            <w:r>
-              <w:rPr>
-                <w:rFonts w:ascii="Calibri" w:cs="Calibri" w:eastAsia="Calibri" w:hAnsi="Calibri"/>
-                <w:sz w:val="20"/>
-                <w:szCs w:val="20"/>
-              </w:rPr>
-              <w:t xml:space="preserve">• Vectorización vs. loops: por qué R no se escribe como Python/C</w:t>
+              <w:t xml:space="preserve">• Operaciones aritméticas</w:t>
+            </w:r>
+          </w:p>
+          <w:p>
+            <w:pPr>
+              <w:spacing w:after="40"/>
+            </w:pPr>
+            <w:r>
+              <w:rPr>
+                <w:rFonts w:ascii="Calibri" w:cs="Calibri" w:eastAsia="Calibri" w:hAnsi="Calibri"/>
+                <w:sz w:val="20"/>
+                <w:szCs w:val="20"/>
+              </w:rPr>
+              <w:t xml:space="preserve">• Variables</w:t>
+            </w:r>
+          </w:p>
+          <w:p>
+            <w:pPr>
+              <w:spacing w:after="40"/>
+            </w:pPr>
+            <w:r>
+              <w:rPr>
+                <w:rFonts w:ascii="Calibri" w:cs="Calibri" w:eastAsia="Calibri" w:hAnsi="Calibri"/>
+                <w:sz w:val="20"/>
+                <w:szCs w:val="20"/>
+              </w:rPr>
+              <w:t xml:space="preserve">• Tipos de datos</w:t>
+            </w:r>
+          </w:p>
+          <w:p>
+            <w:pPr>
+              <w:spacing w:after="40"/>
+            </w:pPr>
+            <w:r>
+              <w:rPr>
+                <w:rFonts w:ascii="Calibri" w:cs="Calibri" w:eastAsia="Calibri" w:hAnsi="Calibri"/>
+                <w:sz w:val="20"/>
+                <w:szCs w:val="20"/>
+              </w:rPr>
+              <w:t xml:space="preserve">• Vectores</w:t>
+            </w:r>
+          </w:p>
+          <w:p>
+            <w:pPr>
+              <w:spacing w:after="40"/>
+            </w:pPr>
+            <w:r>
+              <w:rPr>
+                <w:rFonts w:ascii="Calibri" w:cs="Calibri" w:eastAsia="Calibri" w:hAnsi="Calibri"/>
+                <w:sz w:val="20"/>
+                <w:szCs w:val="20"/>
+              </w:rPr>
+              <w:t xml:space="preserve">• Operadores de comparación</w:t>
+            </w:r>
+          </w:p>
+          <w:p>
+            <w:pPr>
+              <w:spacing w:after="40"/>
+            </w:pPr>
+            <w:r>
+              <w:rPr>
+                <w:rFonts w:ascii="Calibri" w:cs="Calibri" w:eastAsia="Calibri" w:hAnsi="Calibri"/>
+                <w:sz w:val="20"/>
+                <w:szCs w:val="20"/>
+              </w:rPr>
+              <w:t xml:space="preserve">• Ayuda y documentación</w:t>
+            </w:r>
+          </w:p>
+          <w:p>
+            <w:pPr>
+              <w:spacing w:after="40"/>
+            </w:pPr>
+            <w:r>
+              <w:rPr>
+                <w:rFonts w:ascii="Calibri" w:cs="Calibri" w:eastAsia="Calibri" w:hAnsi="Calibri"/>
+                <w:sz w:val="20"/>
+                <w:szCs w:val="20"/>
+              </w:rPr>
+              <w:t xml:space="preserve">• Ejercicios</w:t>
             </w:r>
           </w:p>
         </w:tc>
@@ -465,31 +547,11 @@
                 <w:rFonts w:ascii="Calibri" w:cs="Calibri" w:eastAsia="Calibri" w:hAnsi="Calibri"/>
                 <w:b/>
                 <w:bCs/>
-                <w:i w:val="false"/>
-                <w:iCs w:val="false"/>
-                <w:color w:val="1F3864"/>
+                <w:color w:val="1C7293"/>
                 <w:sz w:val="21"/>
                 <w:szCs w:val="21"/>
               </w:rPr>
-              <w:t xml:space="preserve">Sesión 2</w:t>
-            </w:r>
-          </w:p>
-          <w:p>
-            <w:pPr>
-              <w:spacing w:after="20"/>
-            </w:pPr>
-            <w:r>
-              <w:rPr>
-                <w:rFonts w:ascii="Calibri" w:cs="Calibri" w:eastAsia="Calibri" w:hAnsi="Calibri"/>
-                <w:b w:val="false"/>
-                <w:bCs w:val="false"/>
-                <w:i/>
-                <w:iCs/>
-                <w:color w:val="6B7A85"/>
-                <w:sz w:val="17"/>
-                <w:szCs w:val="17"/>
-              </w:rPr>
-              <w:t xml:space="preserve">Día 1 · tarde</w:t>
+              <w:t xml:space="preserve">Sesión 1</w:t>
             </w:r>
           </w:p>
           <w:p>
@@ -501,13 +563,11 @@
                 <w:rFonts w:ascii="Calibri" w:cs="Calibri" w:eastAsia="Calibri" w:hAnsi="Calibri"/>
                 <w:b/>
                 <w:bCs/>
-                <w:i w:val="false"/>
-                <w:iCs w:val="false"/>
                 <w:color w:val="1F3864"/>
-                <w:sz w:val="17"/>
-                <w:szCs w:val="17"/>
-              </w:rPr>
-              <w:t xml:space="preserve">Funciones y familia apply</w:t>
+                <w:sz w:val="18"/>
+                <w:szCs w:val="18"/>
+              </w:rPr>
+              <w:t xml:space="preserve">Vectores y tipos de datos</w:t>
             </w:r>
           </w:p>
         </w:tc>
@@ -532,33 +592,33 @@
                 <w:sz w:val="20"/>
                 <w:szCs w:val="20"/>
               </w:rPr>
-              <w:t xml:space="preserve">• Estructuras de control y manejo de NA</w:t>
-            </w:r>
-          </w:p>
-          <w:p>
-            <w:pPr>
-              <w:spacing w:after="40"/>
-            </w:pPr>
-            <w:r>
-              <w:rPr>
-                <w:rFonts w:ascii="Calibri" w:cs="Calibri" w:eastAsia="Calibri" w:hAnsi="Calibri"/>
-                <w:sz w:val="20"/>
-                <w:szCs w:val="20"/>
-              </w:rPr>
-              <w:t xml:space="preserve">• Funciones propias: argumentos con default y ... (dots)</w:t>
-            </w:r>
-          </w:p>
-          <w:p>
-            <w:pPr>
-              <w:spacing w:after="40"/>
-            </w:pPr>
-            <w:r>
-              <w:rPr>
-                <w:rFonts w:ascii="Calibri" w:cs="Calibri" w:eastAsia="Calibri" w:hAnsi="Calibri"/>
-                <w:sz w:val="20"/>
-                <w:szCs w:val="20"/>
-              </w:rPr>
-              <w:t xml:space="preserve">• Listas y familia apply (sapply, lapply, vapply)</w:t>
+              <w:t xml:space="preserve">• Consola, scripts, RStudio/Posit y proyectos (.Rproj)</w:t>
+            </w:r>
+          </w:p>
+          <w:p>
+            <w:pPr>
+              <w:spacing w:after="40"/>
+            </w:pPr>
+            <w:r>
+              <w:rPr>
+                <w:rFonts w:ascii="Calibri" w:cs="Calibri" w:eastAsia="Calibri" w:hAnsi="Calibri"/>
+                <w:sz w:val="20"/>
+                <w:szCs w:val="20"/>
+              </w:rPr>
+              <w:t xml:space="preserve">• Tipos de datos y vectores; indexación desde 1 y reciclaje</w:t>
+            </w:r>
+          </w:p>
+          <w:p>
+            <w:pPr>
+              <w:spacing w:after="40"/>
+            </w:pPr>
+            <w:r>
+              <w:rPr>
+                <w:rFonts w:ascii="Calibri" w:cs="Calibri" w:eastAsia="Calibri" w:hAnsi="Calibri"/>
+                <w:sz w:val="20"/>
+                <w:szCs w:val="20"/>
+              </w:rPr>
+              <w:t xml:space="preserve">• Vectorización vs. loops: por qué R no se escribe como Python/C</w:t>
             </w:r>
           </w:p>
         </w:tc>
@@ -583,31 +643,11 @@
                 <w:rFonts w:ascii="Calibri" w:cs="Calibri" w:eastAsia="Calibri" w:hAnsi="Calibri"/>
                 <w:b/>
                 <w:bCs/>
-                <w:i w:val="false"/>
-                <w:iCs w:val="false"/>
-                <w:color w:val="1F3864"/>
+                <w:color w:val="1C7293"/>
                 <w:sz w:val="21"/>
                 <w:szCs w:val="21"/>
               </w:rPr>
-              <w:t xml:space="preserve">Sesión 3</w:t>
-            </w:r>
-          </w:p>
-          <w:p>
-            <w:pPr>
-              <w:spacing w:after="20"/>
-            </w:pPr>
-            <w:r>
-              <w:rPr>
-                <w:rFonts w:ascii="Calibri" w:cs="Calibri" w:eastAsia="Calibri" w:hAnsi="Calibri"/>
-                <w:b w:val="false"/>
-                <w:bCs w:val="false"/>
-                <w:i/>
-                <w:iCs/>
-                <w:color w:val="6B7A85"/>
-                <w:sz w:val="17"/>
-                <w:szCs w:val="17"/>
-              </w:rPr>
-              <w:t xml:space="preserve">Día 2 · mañana</w:t>
+              <w:t xml:space="preserve">Sesión 2</w:t>
             </w:r>
           </w:p>
           <w:p>
@@ -619,13 +659,11 @@
                 <w:rFonts w:ascii="Calibri" w:cs="Calibri" w:eastAsia="Calibri" w:hAnsi="Calibri"/>
                 <w:b/>
                 <w:bCs/>
-                <w:i w:val="false"/>
-                <w:iCs w:val="false"/>
                 <w:color w:val="1F3864"/>
-                <w:sz w:val="17"/>
-                <w:szCs w:val="17"/>
-              </w:rPr>
-              <w:t xml:space="preserve">Importación y verbos de dplyr</w:t>
+                <w:sz w:val="18"/>
+                <w:szCs w:val="18"/>
+              </w:rPr>
+              <w:t xml:space="preserve">Funciones y familia apply</w:t>
             </w:r>
           </w:p>
         </w:tc>
@@ -649,33 +687,33 @@
                 <w:sz w:val="20"/>
                 <w:szCs w:val="20"/>
               </w:rPr>
-              <w:t xml:space="preserve">• data.frame vs. tibble; importación con readr</w:t>
-            </w:r>
-          </w:p>
-          <w:p>
-            <w:pPr>
-              <w:spacing w:after="40"/>
-            </w:pPr>
-            <w:r>
-              <w:rPr>
-                <w:rFonts w:ascii="Calibri" w:cs="Calibri" w:eastAsia="Calibri" w:hAnsi="Calibri"/>
-                <w:sz w:val="20"/>
-                <w:szCs w:val="20"/>
-              </w:rPr>
-              <w:t xml:space="preserve">• El operador pipe %&gt;% para encadenar operaciones</w:t>
-            </w:r>
-          </w:p>
-          <w:p>
-            <w:pPr>
-              <w:spacing w:after="40"/>
-            </w:pPr>
-            <w:r>
-              <w:rPr>
-                <w:rFonts w:ascii="Calibri" w:cs="Calibri" w:eastAsia="Calibri" w:hAnsi="Calibri"/>
-                <w:sz w:val="20"/>
-                <w:szCs w:val="20"/>
-              </w:rPr>
-              <w:t xml:space="preserve">• dplyr: filter, select, mutate, arrange</w:t>
+              <w:t xml:space="preserve">• Estructuras de control y manejo de NA</w:t>
+            </w:r>
+          </w:p>
+          <w:p>
+            <w:pPr>
+              <w:spacing w:after="40"/>
+            </w:pPr>
+            <w:r>
+              <w:rPr>
+                <w:rFonts w:ascii="Calibri" w:cs="Calibri" w:eastAsia="Calibri" w:hAnsi="Calibri"/>
+                <w:sz w:val="20"/>
+                <w:szCs w:val="20"/>
+              </w:rPr>
+              <w:t xml:space="preserve">• Funciones propias: argumentos con default y ... (dots)</w:t>
+            </w:r>
+          </w:p>
+          <w:p>
+            <w:pPr>
+              <w:spacing w:after="40"/>
+            </w:pPr>
+            <w:r>
+              <w:rPr>
+                <w:rFonts w:ascii="Calibri" w:cs="Calibri" w:eastAsia="Calibri" w:hAnsi="Calibri"/>
+                <w:sz w:val="20"/>
+                <w:szCs w:val="20"/>
+              </w:rPr>
+              <w:t xml:space="preserve">• Listas y familia apply (sapply, lapply, vapply)</w:t>
             </w:r>
           </w:p>
         </w:tc>
@@ -701,31 +739,11 @@
                 <w:rFonts w:ascii="Calibri" w:cs="Calibri" w:eastAsia="Calibri" w:hAnsi="Calibri"/>
                 <w:b/>
                 <w:bCs/>
-                <w:i w:val="false"/>
-                <w:iCs w:val="false"/>
-                <w:color w:val="1F3864"/>
+                <w:color w:val="1C7293"/>
                 <w:sz w:val="21"/>
                 <w:szCs w:val="21"/>
               </w:rPr>
-              <w:t xml:space="preserve">Sesión 4</w:t>
-            </w:r>
-          </w:p>
-          <w:p>
-            <w:pPr>
-              <w:spacing w:after="20"/>
-            </w:pPr>
-            <w:r>
-              <w:rPr>
-                <w:rFonts w:ascii="Calibri" w:cs="Calibri" w:eastAsia="Calibri" w:hAnsi="Calibri"/>
-                <w:b w:val="false"/>
-                <w:bCs w:val="false"/>
-                <w:i/>
-                <w:iCs/>
-                <w:color w:val="6B7A85"/>
-                <w:sz w:val="17"/>
-                <w:szCs w:val="17"/>
-              </w:rPr>
-              <w:t xml:space="preserve">Día 2 · tarde</w:t>
+              <w:t xml:space="preserve">Sesión 2b</w:t>
             </w:r>
           </w:p>
           <w:p>
@@ -737,13 +755,11 @@
                 <w:rFonts w:ascii="Calibri" w:cs="Calibri" w:eastAsia="Calibri" w:hAnsi="Calibri"/>
                 <w:b/>
                 <w:bCs/>
-                <w:i w:val="false"/>
-                <w:iCs w:val="false"/>
                 <w:color w:val="1F3864"/>
-                <w:sz w:val="17"/>
-                <w:szCs w:val="17"/>
-              </w:rPr>
-              <w:t xml:space="preserve">Agregación, tidyr y ggplot2</w:t>
+                <w:sz w:val="18"/>
+                <w:szCs w:val="18"/>
+              </w:rPr>
+              <w:t xml:space="preserve">Matrices en R</w:t>
             </w:r>
           </w:p>
         </w:tc>
@@ -768,33 +784,72 @@
                 <w:sz w:val="20"/>
                 <w:szCs w:val="20"/>
               </w:rPr>
-              <w:t xml:space="preserve">• group_by() + summarize(): agregación por grupo</w:t>
-            </w:r>
-          </w:p>
-          <w:p>
-            <w:pPr>
-              <w:spacing w:after="40"/>
-            </w:pPr>
-            <w:r>
-              <w:rPr>
-                <w:rFonts w:ascii="Calibri" w:cs="Calibri" w:eastAsia="Calibri" w:hAnsi="Calibri"/>
-                <w:sz w:val="20"/>
-                <w:szCs w:val="20"/>
-              </w:rPr>
-              <w:t xml:space="preserve">• tidyr: pivot_longer/wider, joins</w:t>
-            </w:r>
-          </w:p>
-          <w:p>
-            <w:pPr>
-              <w:spacing w:after="40"/>
-            </w:pPr>
-            <w:r>
-              <w:rPr>
-                <w:rFonts w:ascii="Calibri" w:cs="Calibri" w:eastAsia="Calibri" w:hAnsi="Calibri"/>
-                <w:sz w:val="20"/>
-                <w:szCs w:val="20"/>
-              </w:rPr>
-              <w:t xml:space="preserve">• ggplot2: gramática de gráficos, geoms y facetas</w:t>
+              <w:t xml:space="preserve">• Crear una matriz</w:t>
+            </w:r>
+          </w:p>
+          <w:p>
+            <w:pPr>
+              <w:spacing w:after="40"/>
+            </w:pPr>
+            <w:r>
+              <w:rPr>
+                <w:rFonts w:ascii="Calibri" w:cs="Calibri" w:eastAsia="Calibri" w:hAnsi="Calibri"/>
+                <w:sz w:val="20"/>
+                <w:szCs w:val="20"/>
+              </w:rPr>
+              <w:t xml:space="preserve">• Operaciones aritméticas</w:t>
+            </w:r>
+          </w:p>
+          <w:p>
+            <w:pPr>
+              <w:spacing w:after="40"/>
+            </w:pPr>
+            <w:r>
+              <w:rPr>
+                <w:rFonts w:ascii="Calibri" w:cs="Calibri" w:eastAsia="Calibri" w:hAnsi="Calibri"/>
+                <w:sz w:val="20"/>
+                <w:szCs w:val="20"/>
+              </w:rPr>
+              <w:t xml:space="preserve">• Operaciones con filas y columnas</w:t>
+            </w:r>
+          </w:p>
+          <w:p>
+            <w:pPr>
+              <w:spacing w:after="40"/>
+            </w:pPr>
+            <w:r>
+              <w:rPr>
+                <w:rFonts w:ascii="Calibri" w:cs="Calibri" w:eastAsia="Calibri" w:hAnsi="Calibri"/>
+                <w:sz w:val="20"/>
+                <w:szCs w:val="20"/>
+              </w:rPr>
+              <w:t xml:space="preserve">• Seleccionar elementos de una matriz</w:t>
+            </w:r>
+          </w:p>
+          <w:p>
+            <w:pPr>
+              <w:spacing w:after="40"/>
+            </w:pPr>
+            <w:r>
+              <w:rPr>
+                <w:rFonts w:ascii="Calibri" w:cs="Calibri" w:eastAsia="Calibri" w:hAnsi="Calibri"/>
+                <w:sz w:val="20"/>
+                <w:szCs w:val="20"/>
+              </w:rPr>
+              <w:t xml:space="preserve">• Crear categorías con la función factor</w:t>
+            </w:r>
+          </w:p>
+          <w:p>
+            <w:pPr>
+              <w:spacing w:after="40"/>
+            </w:pPr>
+            <w:r>
+              <w:rPr>
+                <w:rFonts w:ascii="Calibri" w:cs="Calibri" w:eastAsia="Calibri" w:hAnsi="Calibri"/>
+                <w:sz w:val="20"/>
+                <w:szCs w:val="20"/>
+              </w:rPr>
+              <w:t xml:space="preserve">• Ejercicio sobre matrices</w:t>
             </w:r>
           </w:p>
         </w:tc>
@@ -819,31 +874,11 @@
                 <w:rFonts w:ascii="Calibri" w:cs="Calibri" w:eastAsia="Calibri" w:hAnsi="Calibri"/>
                 <w:b/>
                 <w:bCs/>
-                <w:i w:val="false"/>
-                <w:iCs w:val="false"/>
-                <w:color w:val="1F3864"/>
+                <w:color w:val="1C7293"/>
                 <w:sz w:val="21"/>
                 <w:szCs w:val="21"/>
               </w:rPr>
-              <w:t xml:space="preserve">Sesión 5</w:t>
-            </w:r>
-          </w:p>
-          <w:p>
-            <w:pPr>
-              <w:spacing w:after="20"/>
-            </w:pPr>
-            <w:r>
-              <w:rPr>
-                <w:rFonts w:ascii="Calibri" w:cs="Calibri" w:eastAsia="Calibri" w:hAnsi="Calibri"/>
-                <w:b w:val="false"/>
-                <w:bCs w:val="false"/>
-                <w:i/>
-                <w:iCs/>
-                <w:color w:val="6B7A85"/>
-                <w:sz w:val="17"/>
-                <w:szCs w:val="17"/>
-              </w:rPr>
-              <w:t xml:space="preserve">Día 3 · mañana</w:t>
+              <w:t xml:space="preserve">Sesión 2c</w:t>
             </w:r>
           </w:p>
           <w:p>
@@ -855,13 +890,11 @@
                 <w:rFonts w:ascii="Calibri" w:cs="Calibri" w:eastAsia="Calibri" w:hAnsi="Calibri"/>
                 <w:b/>
                 <w:bCs/>
-                <w:i w:val="false"/>
-                <w:iCs w:val="false"/>
                 <w:color w:val="1F3864"/>
-                <w:sz w:val="17"/>
-                <w:szCs w:val="17"/>
-              </w:rPr>
-              <w:t xml:space="preserve">Proyectos reproducibles</w:t>
+                <w:sz w:val="18"/>
+                <w:szCs w:val="18"/>
+              </w:rPr>
+              <w:t xml:space="preserve">Data Frames en R</w:t>
             </w:r>
           </w:p>
         </w:tc>
@@ -885,33 +918,85 @@
                 <w:sz w:val="20"/>
                 <w:szCs w:val="20"/>
               </w:rPr>
-              <w:t xml:space="preserve">• Organización de proyectos y buenas prácticas</w:t>
-            </w:r>
-          </w:p>
-          <w:p>
-            <w:pPr>
-              <w:spacing w:after="40"/>
-            </w:pPr>
-            <w:r>
-              <w:rPr>
-                <w:rFonts w:ascii="Calibri" w:cs="Calibri" w:eastAsia="Calibri" w:hAnsi="Calibri"/>
-                <w:sz w:val="20"/>
-                <w:szCs w:val="20"/>
-              </w:rPr>
-              <w:t xml:space="preserve">• Quarto/R Markdown para reportes reproducibles</w:t>
-            </w:r>
-          </w:p>
-          <w:p>
-            <w:pPr>
-              <w:spacing w:after="40"/>
-            </w:pPr>
-            <w:r>
-              <w:rPr>
-                <w:rFonts w:ascii="Calibri" w:cs="Calibri" w:eastAsia="Calibri" w:hAnsi="Calibri"/>
-                <w:sz w:val="20"/>
-                <w:szCs w:val="20"/>
-              </w:rPr>
-              <w:t xml:space="preserve">• Documentar y reutilizar funciones propias</w:t>
+              <w:t xml:space="preserve">• Creación de un Data Frame</w:t>
+            </w:r>
+          </w:p>
+          <w:p>
+            <w:pPr>
+              <w:spacing w:after="40"/>
+            </w:pPr>
+            <w:r>
+              <w:rPr>
+                <w:rFonts w:ascii="Calibri" w:cs="Calibri" w:eastAsia="Calibri" w:hAnsi="Calibri"/>
+                <w:sz w:val="20"/>
+                <w:szCs w:val="20"/>
+              </w:rPr>
+              <w:t xml:space="preserve">• Conjuntos de datos de ejemplo en R</w:t>
+            </w:r>
+          </w:p>
+          <w:p>
+            <w:pPr>
+              <w:spacing w:after="40"/>
+            </w:pPr>
+            <w:r>
+              <w:rPr>
+                <w:rFonts w:ascii="Calibri" w:cs="Calibri" w:eastAsia="Calibri" w:hAnsi="Calibri"/>
+                <w:sz w:val="20"/>
+                <w:szCs w:val="20"/>
+              </w:rPr>
+              <w:t xml:space="preserve">• Selección y ordenación</w:t>
+            </w:r>
+          </w:p>
+          <w:p>
+            <w:pPr>
+              <w:spacing w:after="40"/>
+            </w:pPr>
+            <w:r>
+              <w:rPr>
+                <w:rFonts w:ascii="Calibri" w:cs="Calibri" w:eastAsia="Calibri" w:hAnsi="Calibri"/>
+                <w:sz w:val="20"/>
+                <w:szCs w:val="20"/>
+              </w:rPr>
+              <w:t xml:space="preserve">• Exportar e importar datos de un fichero CSV</w:t>
+            </w:r>
+          </w:p>
+          <w:p>
+            <w:pPr>
+              <w:spacing w:after="40"/>
+            </w:pPr>
+            <w:r>
+              <w:rPr>
+                <w:rFonts w:ascii="Calibri" w:cs="Calibri" w:eastAsia="Calibri" w:hAnsi="Calibri"/>
+                <w:sz w:val="20"/>
+                <w:szCs w:val="20"/>
+              </w:rPr>
+              <w:t xml:space="preserve">• Tratamiento de valores nulos</w:t>
+            </w:r>
+          </w:p>
+          <w:p>
+            <w:pPr>
+              <w:spacing w:after="40"/>
+            </w:pPr>
+            <w:r>
+              <w:rPr>
+                <w:rFonts w:ascii="Calibri" w:cs="Calibri" w:eastAsia="Calibri" w:hAnsi="Calibri"/>
+                <w:sz w:val="20"/>
+                <w:szCs w:val="20"/>
+              </w:rPr>
+              <w:t xml:space="preserve">• Operaciones por fila y columna</w:t>
+            </w:r>
+          </w:p>
+          <w:p>
+            <w:pPr>
+              <w:spacing w:after="40"/>
+            </w:pPr>
+            <w:r>
+              <w:rPr>
+                <w:rFonts w:ascii="Calibri" w:cs="Calibri" w:eastAsia="Calibri" w:hAnsi="Calibri"/>
+                <w:sz w:val="20"/>
+                <w:szCs w:val="20"/>
+              </w:rPr>
+              <w:t xml:space="preserve">• Ejercicio sobre Data Frames</w:t>
             </w:r>
           </w:p>
         </w:tc>
@@ -937,31 +1022,11 @@
                 <w:rFonts w:ascii="Calibri" w:cs="Calibri" w:eastAsia="Calibri" w:hAnsi="Calibri"/>
                 <w:b/>
                 <w:bCs/>
-                <w:i w:val="false"/>
-                <w:iCs w:val="false"/>
-                <w:color w:val="1F3864"/>
+                <w:color w:val="1C7293"/>
                 <w:sz w:val="21"/>
                 <w:szCs w:val="21"/>
               </w:rPr>
-              <w:t xml:space="preserve">Sesión 6</w:t>
-            </w:r>
-          </w:p>
-          <w:p>
-            <w:pPr>
-              <w:spacing w:after="20"/>
-            </w:pPr>
-            <w:r>
-              <w:rPr>
-                <w:rFonts w:ascii="Calibri" w:cs="Calibri" w:eastAsia="Calibri" w:hAnsi="Calibri"/>
-                <w:b w:val="false"/>
-                <w:bCs w:val="false"/>
-                <w:i/>
-                <w:iCs/>
-                <w:color w:val="6B7A85"/>
-                <w:sz w:val="17"/>
-                <w:szCs w:val="17"/>
-              </w:rPr>
-              <w:t xml:space="preserve">Día 3 · tarde</w:t>
+              <w:t xml:space="preserve">Sesión 3</w:t>
             </w:r>
           </w:p>
           <w:p>
@@ -973,13 +1038,11 @@
                 <w:rFonts w:ascii="Calibri" w:cs="Calibri" w:eastAsia="Calibri" w:hAnsi="Calibri"/>
                 <w:b/>
                 <w:bCs/>
-                <w:i w:val="false"/>
-                <w:iCs w:val="false"/>
                 <w:color w:val="1F3864"/>
-                <w:sz w:val="17"/>
-                <w:szCs w:val="17"/>
-              </w:rPr>
-              <w:t xml:space="preserve">Cómputo estadístico y simulación</w:t>
+                <w:sz w:val="18"/>
+                <w:szCs w:val="18"/>
+              </w:rPr>
+              <w:t xml:space="preserve">Importación y verbos de dplyr</w:t>
             </w:r>
           </w:p>
         </w:tc>
@@ -1004,33 +1067,33 @@
                 <w:sz w:val="20"/>
                 <w:szCs w:val="20"/>
               </w:rPr>
-              <w:t xml:space="preserve">• Distribuciones en R: familias d/p/q/r</w:t>
-            </w:r>
-          </w:p>
-          <w:p>
-            <w:pPr>
-              <w:spacing w:after="40"/>
-            </w:pPr>
-            <w:r>
-              <w:rPr>
-                <w:rFonts w:ascii="Calibri" w:cs="Calibri" w:eastAsia="Calibri" w:hAnsi="Calibri"/>
-                <w:sz w:val="20"/>
-                <w:szCs w:val="20"/>
-              </w:rPr>
-              <w:t xml:space="preserve">• Números aleatorios y semillas (set.seed)</w:t>
-            </w:r>
-          </w:p>
-          <w:p>
-            <w:pPr>
-              <w:spacing w:after="40"/>
-            </w:pPr>
-            <w:r>
-              <w:rPr>
-                <w:rFonts w:ascii="Calibri" w:cs="Calibri" w:eastAsia="Calibri" w:hAnsi="Calibri"/>
-                <w:sz w:val="20"/>
-                <w:szCs w:val="20"/>
-              </w:rPr>
-              <w:t xml:space="preserve">• Simulación Monte Carlo: ley de grandes números y TLC</w:t>
+              <w:t xml:space="preserve">• data.frame vs. tibble; importación con readr</w:t>
+            </w:r>
+          </w:p>
+          <w:p>
+            <w:pPr>
+              <w:spacing w:after="40"/>
+            </w:pPr>
+            <w:r>
+              <w:rPr>
+                <w:rFonts w:ascii="Calibri" w:cs="Calibri" w:eastAsia="Calibri" w:hAnsi="Calibri"/>
+                <w:sz w:val="20"/>
+                <w:szCs w:val="20"/>
+              </w:rPr>
+              <w:t xml:space="preserve">• El operador pipe %&gt;% para encadenar operaciones</w:t>
+            </w:r>
+          </w:p>
+          <w:p>
+            <w:pPr>
+              <w:spacing w:after="40"/>
+            </w:pPr>
+            <w:r>
+              <w:rPr>
+                <w:rFonts w:ascii="Calibri" w:cs="Calibri" w:eastAsia="Calibri" w:hAnsi="Calibri"/>
+                <w:sz w:val="20"/>
+                <w:szCs w:val="20"/>
+              </w:rPr>
+              <w:t xml:space="preserve">• dplyr: filter, select, mutate, arrange</w:t>
             </w:r>
           </w:p>
         </w:tc>
@@ -1055,31 +1118,11 @@
                 <w:rFonts w:ascii="Calibri" w:cs="Calibri" w:eastAsia="Calibri" w:hAnsi="Calibri"/>
                 <w:b/>
                 <w:bCs/>
-                <w:i w:val="false"/>
-                <w:iCs w:val="false"/>
-                <w:color w:val="1F3864"/>
+                <w:color w:val="1C7293"/>
                 <w:sz w:val="21"/>
                 <w:szCs w:val="21"/>
               </w:rPr>
-              <w:t xml:space="preserve">Sesión 7</w:t>
-            </w:r>
-          </w:p>
-          <w:p>
-            <w:pPr>
-              <w:spacing w:after="20"/>
-            </w:pPr>
-            <w:r>
-              <w:rPr>
-                <w:rFonts w:ascii="Calibri" w:cs="Calibri" w:eastAsia="Calibri" w:hAnsi="Calibri"/>
-                <w:b w:val="false"/>
-                <w:bCs w:val="false"/>
-                <w:i/>
-                <w:iCs/>
-                <w:color w:val="6B7A85"/>
-                <w:sz w:val="17"/>
-                <w:szCs w:val="17"/>
-              </w:rPr>
-              <w:t xml:space="preserve">Día 4 · mañana</w:t>
+              <w:t xml:space="preserve">Sesión 4</w:t>
             </w:r>
           </w:p>
           <w:p>
@@ -1091,13 +1134,11 @@
                 <w:rFonts w:ascii="Calibri" w:cs="Calibri" w:eastAsia="Calibri" w:hAnsi="Calibri"/>
                 <w:b/>
                 <w:bCs/>
-                <w:i w:val="false"/>
-                <w:iCs w:val="false"/>
                 <w:color w:val="1F3864"/>
-                <w:sz w:val="17"/>
-                <w:szCs w:val="17"/>
-              </w:rPr>
-              <w:t xml:space="preserve">Regresión lineal</w:t>
+                <w:sz w:val="18"/>
+                <w:szCs w:val="18"/>
+              </w:rPr>
+              <w:t xml:space="preserve">Agregación, tidyr y ggplot2</w:t>
             </w:r>
           </w:p>
         </w:tc>
@@ -1121,33 +1162,33 @@
                 <w:sz w:val="20"/>
                 <w:szCs w:val="20"/>
               </w:rPr>
-              <w:t xml:space="preserve">• Fórmulas en R (y ~ x) y su interpretación</w:t>
-            </w:r>
-          </w:p>
-          <w:p>
-            <w:pPr>
-              <w:spacing w:after="40"/>
-            </w:pPr>
-            <w:r>
-              <w:rPr>
-                <w:rFonts w:ascii="Calibri" w:cs="Calibri" w:eastAsia="Calibri" w:hAnsi="Calibri"/>
-                <w:sz w:val="20"/>
-                <w:szCs w:val="20"/>
-              </w:rPr>
-              <w:t xml:space="preserve">• lm(): ajuste, summary() y coeficientes</w:t>
-            </w:r>
-          </w:p>
-          <w:p>
-            <w:pPr>
-              <w:spacing w:after="40"/>
-            </w:pPr>
-            <w:r>
-              <w:rPr>
-                <w:rFonts w:ascii="Calibri" w:cs="Calibri" w:eastAsia="Calibri" w:hAnsi="Calibri"/>
-                <w:sz w:val="20"/>
-                <w:szCs w:val="20"/>
-              </w:rPr>
-              <w:t xml:space="preserve">• Factores, niveles de referencia y contrastes</w:t>
+              <w:t xml:space="preserve">• group_by() + summarize(): agregación por grupo</w:t>
+            </w:r>
+          </w:p>
+          <w:p>
+            <w:pPr>
+              <w:spacing w:after="40"/>
+            </w:pPr>
+            <w:r>
+              <w:rPr>
+                <w:rFonts w:ascii="Calibri" w:cs="Calibri" w:eastAsia="Calibri" w:hAnsi="Calibri"/>
+                <w:sz w:val="20"/>
+                <w:szCs w:val="20"/>
+              </w:rPr>
+              <w:t xml:space="preserve">• tidyr: pivot_longer/wider, joins</w:t>
+            </w:r>
+          </w:p>
+          <w:p>
+            <w:pPr>
+              <w:spacing w:after="40"/>
+            </w:pPr>
+            <w:r>
+              <w:rPr>
+                <w:rFonts w:ascii="Calibri" w:cs="Calibri" w:eastAsia="Calibri" w:hAnsi="Calibri"/>
+                <w:sz w:val="20"/>
+                <w:szCs w:val="20"/>
+              </w:rPr>
+              <w:t xml:space="preserve">• ggplot2: gramática de gráficos, geoms y facetas</w:t>
             </w:r>
           </w:p>
         </w:tc>
@@ -1173,31 +1214,11 @@
                 <w:rFonts w:ascii="Calibri" w:cs="Calibri" w:eastAsia="Calibri" w:hAnsi="Calibri"/>
                 <w:b/>
                 <w:bCs/>
-                <w:i w:val="false"/>
-                <w:iCs w:val="false"/>
-                <w:color w:val="1F3864"/>
+                <w:color w:val="1C7293"/>
                 <w:sz w:val="21"/>
                 <w:szCs w:val="21"/>
               </w:rPr>
-              <w:t xml:space="preserve">Sesión 8</w:t>
-            </w:r>
-          </w:p>
-          <w:p>
-            <w:pPr>
-              <w:spacing w:after="20"/>
-            </w:pPr>
-            <w:r>
-              <w:rPr>
-                <w:rFonts w:ascii="Calibri" w:cs="Calibri" w:eastAsia="Calibri" w:hAnsi="Calibri"/>
-                <w:b w:val="false"/>
-                <w:bCs w:val="false"/>
-                <w:i/>
-                <w:iCs/>
-                <w:color w:val="6B7A85"/>
-                <w:sz w:val="17"/>
-                <w:szCs w:val="17"/>
-              </w:rPr>
-              <w:t xml:space="preserve">Día 4 · tarde</w:t>
+              <w:t xml:space="preserve">Sesión 5</w:t>
             </w:r>
           </w:p>
           <w:p>
@@ -1209,13 +1230,11 @@
                 <w:rFonts w:ascii="Calibri" w:cs="Calibri" w:eastAsia="Calibri" w:hAnsi="Calibri"/>
                 <w:b/>
                 <w:bCs/>
-                <w:i w:val="false"/>
-                <w:iCs w:val="false"/>
                 <w:color w:val="1F3864"/>
-                <w:sz w:val="17"/>
-                <w:szCs w:val="17"/>
-              </w:rPr>
-              <w:t xml:space="preserve">Diagnóstico y ANOVA</w:t>
+                <w:sz w:val="18"/>
+                <w:szCs w:val="18"/>
+              </w:rPr>
+              <w:t xml:space="preserve">Proyectos reproducibles</w:t>
             </w:r>
           </w:p>
         </w:tc>
@@ -1240,33 +1259,33 @@
                 <w:sz w:val="20"/>
                 <w:szCs w:val="20"/>
               </w:rPr>
-              <w:t xml:space="preserve">• Interacciones entre predictores</w:t>
-            </w:r>
-          </w:p>
-          <w:p>
-            <w:pPr>
-              <w:spacing w:after="40"/>
-            </w:pPr>
-            <w:r>
-              <w:rPr>
-                <w:rFonts w:ascii="Calibri" w:cs="Calibri" w:eastAsia="Calibri" w:hAnsi="Calibri"/>
-                <w:sz w:val="20"/>
-                <w:szCs w:val="20"/>
-              </w:rPr>
-              <w:t xml:space="preserve">• Diagnóstico de supuestos: residuos, plot.lm(), colinealidad</w:t>
-            </w:r>
-          </w:p>
-          <w:p>
-            <w:pPr>
-              <w:spacing w:after="40"/>
-            </w:pPr>
-            <w:r>
-              <w:rPr>
-                <w:rFonts w:ascii="Calibri" w:cs="Calibri" w:eastAsia="Calibri" w:hAnsi="Calibri"/>
-                <w:sz w:val="20"/>
-                <w:szCs w:val="20"/>
-              </w:rPr>
-              <w:t xml:space="preserve">• ANOVA y comparación de modelos anidados</w:t>
+              <w:t xml:space="preserve">• Organización de proyectos y buenas prácticas</w:t>
+            </w:r>
+          </w:p>
+          <w:p>
+            <w:pPr>
+              <w:spacing w:after="40"/>
+            </w:pPr>
+            <w:r>
+              <w:rPr>
+                <w:rFonts w:ascii="Calibri" w:cs="Calibri" w:eastAsia="Calibri" w:hAnsi="Calibri"/>
+                <w:sz w:val="20"/>
+                <w:szCs w:val="20"/>
+              </w:rPr>
+              <w:t xml:space="preserve">• Quarto/R Markdown para reportes reproducibles</w:t>
+            </w:r>
+          </w:p>
+          <w:p>
+            <w:pPr>
+              <w:spacing w:after="40"/>
+            </w:pPr>
+            <w:r>
+              <w:rPr>
+                <w:rFonts w:ascii="Calibri" w:cs="Calibri" w:eastAsia="Calibri" w:hAnsi="Calibri"/>
+                <w:sz w:val="20"/>
+                <w:szCs w:val="20"/>
+              </w:rPr>
+              <w:t xml:space="preserve">• Documentar y reutilizar funciones propias</w:t>
             </w:r>
           </w:p>
         </w:tc>
@@ -1291,31 +1310,11 @@
                 <w:rFonts w:ascii="Calibri" w:cs="Calibri" w:eastAsia="Calibri" w:hAnsi="Calibri"/>
                 <w:b/>
                 <w:bCs/>
-                <w:i w:val="false"/>
-                <w:iCs w:val="false"/>
-                <w:color w:val="1F3864"/>
+                <w:color w:val="1C7293"/>
                 <w:sz w:val="21"/>
                 <w:szCs w:val="21"/>
               </w:rPr>
-              <w:t xml:space="preserve">Sesión 9</w:t>
-            </w:r>
-          </w:p>
-          <w:p>
-            <w:pPr>
-              <w:spacing w:after="20"/>
-            </w:pPr>
-            <w:r>
-              <w:rPr>
-                <w:rFonts w:ascii="Calibri" w:cs="Calibri" w:eastAsia="Calibri" w:hAnsi="Calibri"/>
-                <w:b w:val="false"/>
-                <w:bCs w:val="false"/>
-                <w:i/>
-                <w:iCs/>
-                <w:color w:val="6B7A85"/>
-                <w:sz w:val="17"/>
-                <w:szCs w:val="17"/>
-              </w:rPr>
-              <w:t xml:space="preserve">Día 5 · mañana</w:t>
+              <w:t xml:space="preserve">Sesión 6</w:t>
             </w:r>
           </w:p>
           <w:p>
@@ -1327,13 +1326,11 @@
                 <w:rFonts w:ascii="Calibri" w:cs="Calibri" w:eastAsia="Calibri" w:hAnsi="Calibri"/>
                 <w:b/>
                 <w:bCs/>
-                <w:i w:val="false"/>
-                <w:iCs w:val="false"/>
                 <w:color w:val="1F3864"/>
-                <w:sz w:val="17"/>
-                <w:szCs w:val="17"/>
-              </w:rPr>
-              <w:t xml:space="preserve">Modelos lineales generalizados</w:t>
+                <w:sz w:val="18"/>
+                <w:szCs w:val="18"/>
+              </w:rPr>
+              <w:t xml:space="preserve">Cómputo estadístico y simulación</w:t>
             </w:r>
           </w:p>
         </w:tc>
@@ -1357,20 +1354,33 @@
                 <w:sz w:val="20"/>
                 <w:szCs w:val="20"/>
               </w:rPr>
-              <w:t xml:space="preserve">• glm(): regresión logística y de Poisson</w:t>
-            </w:r>
-          </w:p>
-          <w:p>
-            <w:pPr>
-              <w:spacing w:after="40"/>
-            </w:pPr>
-            <w:r>
-              <w:rPr>
-                <w:rFonts w:ascii="Calibri" w:cs="Calibri" w:eastAsia="Calibri" w:hAnsi="Calibri"/>
-                <w:sz w:val="20"/>
-                <w:szCs w:val="20"/>
-              </w:rPr>
-              <w:t xml:space="preserve">• Selección de modelos: AIC/BIC, step()</w:t>
+              <w:t xml:space="preserve">• Distribuciones en R: familias d/p/q/r</w:t>
+            </w:r>
+          </w:p>
+          <w:p>
+            <w:pPr>
+              <w:spacing w:after="40"/>
+            </w:pPr>
+            <w:r>
+              <w:rPr>
+                <w:rFonts w:ascii="Calibri" w:cs="Calibri" w:eastAsia="Calibri" w:hAnsi="Calibri"/>
+                <w:sz w:val="20"/>
+                <w:szCs w:val="20"/>
+              </w:rPr>
+              <w:t xml:space="preserve">• Números aleatorios y semillas (set.seed)</w:t>
+            </w:r>
+          </w:p>
+          <w:p>
+            <w:pPr>
+              <w:spacing w:after="40"/>
+            </w:pPr>
+            <w:r>
+              <w:rPr>
+                <w:rFonts w:ascii="Calibri" w:cs="Calibri" w:eastAsia="Calibri" w:hAnsi="Calibri"/>
+                <w:sz w:val="20"/>
+                <w:szCs w:val="20"/>
+              </w:rPr>
+              <w:t xml:space="preserve">• Simulación Monte Carlo: ley de grandes números y TLC</w:t>
             </w:r>
           </w:p>
         </w:tc>
@@ -1396,31 +1406,11 @@
                 <w:rFonts w:ascii="Calibri" w:cs="Calibri" w:eastAsia="Calibri" w:hAnsi="Calibri"/>
                 <w:b/>
                 <w:bCs/>
-                <w:i w:val="false"/>
-                <w:iCs w:val="false"/>
-                <w:color w:val="1F3864"/>
+                <w:color w:val="1C7293"/>
                 <w:sz w:val="21"/>
                 <w:szCs w:val="21"/>
               </w:rPr>
-              <w:t xml:space="preserve">Sesión 10</w:t>
-            </w:r>
-          </w:p>
-          <w:p>
-            <w:pPr>
-              <w:spacing w:after="20"/>
-            </w:pPr>
-            <w:r>
-              <w:rPr>
-                <w:rFonts w:ascii="Calibri" w:cs="Calibri" w:eastAsia="Calibri" w:hAnsi="Calibri"/>
-                <w:b w:val="false"/>
-                <w:bCs w:val="false"/>
-                <w:i/>
-                <w:iCs/>
-                <w:color w:val="6B7A85"/>
-                <w:sz w:val="17"/>
-                <w:szCs w:val="17"/>
-              </w:rPr>
-              <w:t xml:space="preserve">Día 5 · tarde</w:t>
+              <w:t xml:space="preserve">Sesión 7</w:t>
             </w:r>
           </w:p>
           <w:p>
@@ -1432,13 +1422,11 @@
                 <w:rFonts w:ascii="Calibri" w:cs="Calibri" w:eastAsia="Calibri" w:hAnsi="Calibri"/>
                 <w:b/>
                 <w:bCs/>
-                <w:i w:val="false"/>
-                <w:iCs w:val="false"/>
                 <w:color w:val="1F3864"/>
-                <w:sz w:val="17"/>
-                <w:szCs w:val="17"/>
-              </w:rPr>
-              <w:t xml:space="preserve">Validación y cierre</w:t>
+                <w:sz w:val="18"/>
+                <w:szCs w:val="18"/>
+              </w:rPr>
+              <w:t xml:space="preserve">Regresión lineal</w:t>
             </w:r>
           </w:p>
         </w:tc>
@@ -1446,6 +1434,280 @@
           <w:tcPr>
             <w:tcW w:type="dxa" w:w="7000"/>
             <w:shd w:fill="DDEBF7" w:val="clear"/>
+            <w:tcMar>
+              <w:top w:type="dxa" w:w="80"/>
+              <w:left w:type="dxa" w:w="100"/>
+              <w:bottom w:type="dxa" w:w="80"/>
+              <w:right w:type="dxa" w:w="100"/>
+            </w:tcMar>
+          </w:tcPr>
+          <w:p>
+            <w:pPr>
+              <w:spacing w:after="40"/>
+            </w:pPr>
+            <w:r>
+              <w:rPr>
+                <w:rFonts w:ascii="Calibri" w:cs="Calibri" w:eastAsia="Calibri" w:hAnsi="Calibri"/>
+                <w:sz w:val="20"/>
+                <w:szCs w:val="20"/>
+              </w:rPr>
+              <w:t xml:space="preserve">• Fórmulas en R (y ~ x) y su interpretación</w:t>
+            </w:r>
+          </w:p>
+          <w:p>
+            <w:pPr>
+              <w:spacing w:after="40"/>
+            </w:pPr>
+            <w:r>
+              <w:rPr>
+                <w:rFonts w:ascii="Calibri" w:cs="Calibri" w:eastAsia="Calibri" w:hAnsi="Calibri"/>
+                <w:sz w:val="20"/>
+                <w:szCs w:val="20"/>
+              </w:rPr>
+              <w:t xml:space="preserve">• lm(): ajuste, summary() y coeficientes</w:t>
+            </w:r>
+          </w:p>
+          <w:p>
+            <w:pPr>
+              <w:spacing w:after="40"/>
+            </w:pPr>
+            <w:r>
+              <w:rPr>
+                <w:rFonts w:ascii="Calibri" w:cs="Calibri" w:eastAsia="Calibri" w:hAnsi="Calibri"/>
+                <w:sz w:val="20"/>
+                <w:szCs w:val="20"/>
+              </w:rPr>
+              <w:t xml:space="preserve">• Factores, niveles de referencia y contrastes</w:t>
+            </w:r>
+          </w:p>
+        </w:tc>
+      </w:tr>
+      <w:tr>
+        <w:tc>
+          <w:tcPr>
+            <w:tcW w:type="dxa" w:w="2500"/>
+            <w:tcMar>
+              <w:top w:type="dxa" w:w="80"/>
+              <w:left w:type="dxa" w:w="100"/>
+              <w:bottom w:type="dxa" w:w="80"/>
+              <w:right w:type="dxa" w:w="100"/>
+            </w:tcMar>
+          </w:tcPr>
+          <w:p>
+            <w:pPr>
+              <w:spacing w:after="20"/>
+            </w:pPr>
+            <w:r>
+              <w:rPr>
+                <w:rFonts w:ascii="Calibri" w:cs="Calibri" w:eastAsia="Calibri" w:hAnsi="Calibri"/>
+                <w:b/>
+                <w:bCs/>
+                <w:color w:val="1C7293"/>
+                <w:sz w:val="21"/>
+                <w:szCs w:val="21"/>
+              </w:rPr>
+              <w:t xml:space="preserve">Sesión 8</w:t>
+            </w:r>
+          </w:p>
+          <w:p>
+            <w:pPr>
+              <w:spacing w:after="0"/>
+            </w:pPr>
+            <w:r>
+              <w:rPr>
+                <w:rFonts w:ascii="Calibri" w:cs="Calibri" w:eastAsia="Calibri" w:hAnsi="Calibri"/>
+                <w:b/>
+                <w:bCs/>
+                <w:color w:val="1F3864"/>
+                <w:sz w:val="18"/>
+                <w:szCs w:val="18"/>
+              </w:rPr>
+              <w:t xml:space="preserve">Diagnóstico y ANOVA</w:t>
+            </w:r>
+          </w:p>
+        </w:tc>
+        <w:tc>
+          <w:tcPr>
+            <w:tcW w:type="dxa" w:w="7000"/>
+            <w:tcMar>
+              <w:top w:type="dxa" w:w="80"/>
+              <w:left w:type="dxa" w:w="100"/>
+              <w:bottom w:type="dxa" w:w="80"/>
+              <w:right w:type="dxa" w:w="100"/>
+            </w:tcMar>
+          </w:tcPr>
+          <w:p>
+            <w:pPr>
+              <w:spacing w:after="40"/>
+            </w:pPr>
+            <w:r>
+              <w:rPr>
+                <w:rFonts w:ascii="Calibri" w:cs="Calibri" w:eastAsia="Calibri" w:hAnsi="Calibri"/>
+                <w:sz w:val="20"/>
+                <w:szCs w:val="20"/>
+              </w:rPr>
+              <w:t xml:space="preserve">• Interacciones entre predictores</w:t>
+            </w:r>
+          </w:p>
+          <w:p>
+            <w:pPr>
+              <w:spacing w:after="40"/>
+            </w:pPr>
+            <w:r>
+              <w:rPr>
+                <w:rFonts w:ascii="Calibri" w:cs="Calibri" w:eastAsia="Calibri" w:hAnsi="Calibri"/>
+                <w:sz w:val="20"/>
+                <w:szCs w:val="20"/>
+              </w:rPr>
+              <w:t xml:space="preserve">• Diagnóstico de supuestos: residuos, plot.lm(), colinealidad</w:t>
+            </w:r>
+          </w:p>
+          <w:p>
+            <w:pPr>
+              <w:spacing w:after="40"/>
+            </w:pPr>
+            <w:r>
+              <w:rPr>
+                <w:rFonts w:ascii="Calibri" w:cs="Calibri" w:eastAsia="Calibri" w:hAnsi="Calibri"/>
+                <w:sz w:val="20"/>
+                <w:szCs w:val="20"/>
+              </w:rPr>
+              <w:t xml:space="preserve">• ANOVA y comparación de modelos anidados</w:t>
+            </w:r>
+          </w:p>
+        </w:tc>
+      </w:tr>
+      <w:tr>
+        <w:tc>
+          <w:tcPr>
+            <w:tcW w:type="dxa" w:w="2500"/>
+            <w:shd w:fill="DDEBF7" w:val="clear"/>
+            <w:tcMar>
+              <w:top w:type="dxa" w:w="80"/>
+              <w:left w:type="dxa" w:w="100"/>
+              <w:bottom w:type="dxa" w:w="80"/>
+              <w:right w:type="dxa" w:w="100"/>
+            </w:tcMar>
+          </w:tcPr>
+          <w:p>
+            <w:pPr>
+              <w:spacing w:after="20"/>
+            </w:pPr>
+            <w:r>
+              <w:rPr>
+                <w:rFonts w:ascii="Calibri" w:cs="Calibri" w:eastAsia="Calibri" w:hAnsi="Calibri"/>
+                <w:b/>
+                <w:bCs/>
+                <w:color w:val="1C7293"/>
+                <w:sz w:val="21"/>
+                <w:szCs w:val="21"/>
+              </w:rPr>
+              <w:t xml:space="preserve">Sesión 9</w:t>
+            </w:r>
+          </w:p>
+          <w:p>
+            <w:pPr>
+              <w:spacing w:after="0"/>
+            </w:pPr>
+            <w:r>
+              <w:rPr>
+                <w:rFonts w:ascii="Calibri" w:cs="Calibri" w:eastAsia="Calibri" w:hAnsi="Calibri"/>
+                <w:b/>
+                <w:bCs/>
+                <w:color w:val="1F3864"/>
+                <w:sz w:val="18"/>
+                <w:szCs w:val="18"/>
+              </w:rPr>
+              <w:t xml:space="preserve">Modelos lineales generalizados</w:t>
+            </w:r>
+          </w:p>
+        </w:tc>
+        <w:tc>
+          <w:tcPr>
+            <w:tcW w:type="dxa" w:w="7000"/>
+            <w:shd w:fill="DDEBF7" w:val="clear"/>
+            <w:tcMar>
+              <w:top w:type="dxa" w:w="80"/>
+              <w:left w:type="dxa" w:w="100"/>
+              <w:bottom w:type="dxa" w:w="80"/>
+              <w:right w:type="dxa" w:w="100"/>
+            </w:tcMar>
+          </w:tcPr>
+          <w:p>
+            <w:pPr>
+              <w:spacing w:after="40"/>
+            </w:pPr>
+            <w:r>
+              <w:rPr>
+                <w:rFonts w:ascii="Calibri" w:cs="Calibri" w:eastAsia="Calibri" w:hAnsi="Calibri"/>
+                <w:sz w:val="20"/>
+                <w:szCs w:val="20"/>
+              </w:rPr>
+              <w:t xml:space="preserve">• glm(): regresión logística y de Poisson</w:t>
+            </w:r>
+          </w:p>
+          <w:p>
+            <w:pPr>
+              <w:spacing w:after="40"/>
+            </w:pPr>
+            <w:r>
+              <w:rPr>
+                <w:rFonts w:ascii="Calibri" w:cs="Calibri" w:eastAsia="Calibri" w:hAnsi="Calibri"/>
+                <w:sz w:val="20"/>
+                <w:szCs w:val="20"/>
+              </w:rPr>
+              <w:t xml:space="preserve">• Selección de modelos: AIC/BIC, step()</w:t>
+            </w:r>
+          </w:p>
+        </w:tc>
+      </w:tr>
+      <w:tr>
+        <w:tc>
+          <w:tcPr>
+            <w:tcW w:type="dxa" w:w="2500"/>
+            <w:tcMar>
+              <w:top w:type="dxa" w:w="80"/>
+              <w:left w:type="dxa" w:w="100"/>
+              <w:bottom w:type="dxa" w:w="80"/>
+              <w:right w:type="dxa" w:w="100"/>
+            </w:tcMar>
+          </w:tcPr>
+          <w:p>
+            <w:pPr>
+              <w:spacing w:after="20"/>
+            </w:pPr>
+            <w:r>
+              <w:rPr>
+                <w:rFonts w:ascii="Calibri" w:cs="Calibri" w:eastAsia="Calibri" w:hAnsi="Calibri"/>
+                <w:b/>
+                <w:bCs/>
+                <w:color w:val="1C7293"/>
+                <w:sz w:val="21"/>
+                <w:szCs w:val="21"/>
+              </w:rPr>
+              <w:t xml:space="preserve">Sesión 10</w:t>
+            </w:r>
+          </w:p>
+          <w:p>
+            <w:pPr>
+              <w:spacing w:after="0"/>
+            </w:pPr>
+            <w:r>
+              <w:rPr>
+                <w:rFonts w:ascii="Calibri" w:cs="Calibri" w:eastAsia="Calibri" w:hAnsi="Calibri"/>
+                <w:b/>
+                <w:bCs/>
+                <w:color w:val="1F3864"/>
+                <w:sz w:val="18"/>
+                <w:szCs w:val="18"/>
+              </w:rPr>
+              <w:t xml:space="preserve">Validación y cierre</w:t>
+            </w:r>
+          </w:p>
+        </w:tc>
+        <w:tc>
+          <w:tcPr>
+            <w:tcW w:type="dxa" w:w="7000"/>
             <w:tcMar>
               <w:top w:type="dxa" w:w="80"/>
               <w:left w:type="dxa" w:w="100"/>
@@ -1517,7 +1779,7 @@
         <w:rPr>
           <w:rFonts w:ascii="Calibri" w:cs="Calibri" w:eastAsia="Calibri" w:hAnsi="Calibri"/>
         </w:rPr>
-        <w:t xml:space="preserve">Ejercicios de práctica por sesión (40%): entregables cortos al cierre de cada una de las 10 sesiones.</w:t>
+        <w:t xml:space="preserve">Ejercicios de práctica por sesión (40%): entregables cortos al cierre de cada sesión.</w:t>
       </w:r>
     </w:p>
     <w:p>
@@ -1569,7 +1831,7 @@
         <w:rPr>
           <w:rFonts w:ascii="Calibri" w:cs="Calibri" w:eastAsia="Calibri" w:hAnsi="Calibri"/>
         </w:rPr>
-        <w:t xml:space="preserve">Experiencia de programación en al menos un lenguaje (cualquiera).</w:t>
+        <w:t xml:space="preserve">Ninguno para las sesiones 0, 2b y 2c (parten de cero).</w:t>
       </w:r>
     </w:p>
     <w:p>
@@ -1585,7 +1847,7 @@
         <w:rPr>
           <w:rFonts w:ascii="Calibri" w:cs="Calibri" w:eastAsia="Calibri" w:hAnsi="Calibri"/>
         </w:rPr>
-        <w:t xml:space="preserve">Laptop propia con R y RStudio (o Positron/VS Code) instalados antes de la sesión 1.</w:t>
+        <w:t xml:space="preserve">Para las sesiones 1 en adelante: experiencia de programación en al menos un lenguaje (cualquiera).</w:t>
       </w:r>
     </w:p>
     <w:p>
@@ -1601,16 +1863,7 @@
         <w:rPr>
           <w:rFonts w:ascii="Calibri" w:cs="Calibri" w:eastAsia="Calibri" w:hAnsi="Calibri"/>
         </w:rPr>
-        <w:t xml:space="preserve">No se requiere experiencia previa en R ni en estadística más allá de un curso básico de probabilidad y estadística de licenciatura.</w:t>
-      </w:r>
-    </w:p>
-    <w:p>
-      <w:pPr>
-        <w:pStyle w:val="Heading1"/>
-        <w:spacing w:after="150" w:before="300"/>
-      </w:pPr>
-      <w:r>
-        <w:t xml:space="preserve">Material y software</w:t>
+        <w:t xml:space="preserve">Laptop propia con R y RStudio (o Positron/VS Code) instalados antes de la sesión 0.</w:t>
       </w:r>
     </w:p>
     <w:p>
@@ -1626,7 +1879,16 @@
         <w:rPr>
           <w:rFonts w:ascii="Calibri" w:cs="Calibri" w:eastAsia="Calibri" w:hAnsi="Calibri"/>
         </w:rPr>
-        <w:t xml:space="preserve">R (versión reciente) y RStudio Desktop, o Positron.</w:t>
+        <w:t xml:space="preserve">No se requiere experiencia previa en estadística más allá de un curso básico de probabilidad y estadística de licenciatura.</w:t>
+      </w:r>
+    </w:p>
+    <w:p>
+      <w:pPr>
+        <w:pStyle w:val="Heading1"/>
+        <w:spacing w:after="150" w:before="300"/>
+      </w:pPr>
+      <w:r>
+        <w:t xml:space="preserve">Material y software</w:t>
       </w:r>
     </w:p>
     <w:p>
@@ -1642,7 +1904,23 @@
         <w:rPr>
           <w:rFonts w:ascii="Calibri" w:cs="Calibri" w:eastAsia="Calibri" w:hAnsi="Calibri"/>
         </w:rPr>
-        <w:t xml:space="preserve">Paquetes: tidyverse, broom, quarto (o rmarkdown).</w:t>
+        <w:t xml:space="preserve">R (versión reciente) y RStudio Desktop, o Positron.</w:t>
+      </w:r>
+    </w:p>
+    <w:p>
+      <w:pPr>
+        <w:pStyle w:val="ListParagraph"/>
+        <w:numPr>
+          <w:ilvl w:val="0"/>
+          <w:numId w:val="2"/>
+        </w:numPr>
+        <w:spacing w:after="60"/>
+      </w:pPr>
+      <w:r>
+        <w:rPr>
+          <w:rFonts w:ascii="Calibri" w:cs="Calibri" w:eastAsia="Calibri" w:hAnsi="Calibri"/>
+        </w:rPr>
+        <w:t xml:space="preserve">Paquetes: tidyverse, broom, car, quarto (o rmarkdown).</w:t>
       </w:r>
     </w:p>
     <w:p>

</xml_diff>

<commit_message>
Amplía estructuras de control en la sesión 2
- sesion02_funciones_apply.R / capitulo02_funciones_apply.md: se agrega
  while, repeat, break/next y switch() junto a los ya existentes for e
  if/else, con dos ejercicios nuevos (Fibonacci con while, y
  next/break en un for).
- docs/silabo.md y Silabo_Curso_R_CIMAT.docx: fila de la sesión 2
  actualizada para reflejar el contenido ampliado.
</commit_message>
<xml_diff>
--- a/docs/Silabo_Curso_R_CIMAT.docx
+++ b/docs/Silabo_Curso_R_CIMAT.docx
@@ -687,7 +687,20 @@
                 <w:sz w:val="20"/>
                 <w:szCs w:val="20"/>
               </w:rPr>
-              <w:t xml:space="preserve">• Estructuras de control y manejo de NA</w:t>
+              <w:t xml:space="preserve">• Manejo de NA</w:t>
+            </w:r>
+          </w:p>
+          <w:p>
+            <w:pPr>
+              <w:spacing w:after="40"/>
+            </w:pPr>
+            <w:r>
+              <w:rPr>
+                <w:rFonts w:ascii="Calibri" w:cs="Calibri" w:eastAsia="Calibri" w:hAnsi="Calibri"/>
+                <w:sz w:val="20"/>
+                <w:szCs w:val="20"/>
+              </w:rPr>
+              <w:t xml:space="preserve">• Estructuras de control: for, if/else, while, repeat, break/next, switch</w:t>
             </w:r>
           </w:p>
           <w:p>

</xml_diff>

<commit_message>
Amplía Sesión 2 (return/anónimas/scope/recursión), Sesión 6 (datos ficticios), Sesión 0 (instalar/cargar librerías) y Sesión 3 (stringr)
</commit_message>
<xml_diff>
--- a/docs/Silabo_Curso_R_CIMAT.docx
+++ b/docs/Silabo_Curso_R_CIMAT.docx
@@ -521,6 +521,19 @@
                 <w:sz w:val="20"/>
                 <w:szCs w:val="20"/>
               </w:rPr>
+              <w:t xml:space="preserve">• Instalar y cargar librerías (install.packages, library, CRAN)</w:t>
+            </w:r>
+          </w:p>
+          <w:p>
+            <w:pPr>
+              <w:spacing w:after="40"/>
+            </w:pPr>
+            <w:r>
+              <w:rPr>
+                <w:rFonts w:ascii="Calibri" w:cs="Calibri" w:eastAsia="Calibri" w:hAnsi="Calibri"/>
+                <w:sz w:val="20"/>
+                <w:szCs w:val="20"/>
+              </w:rPr>
               <w:t xml:space="preserve">• Ejercicios</w:t>
             </w:r>
           </w:p>
@@ -713,7 +726,7 @@
                 <w:sz w:val="20"/>
                 <w:szCs w:val="20"/>
               </w:rPr>
-              <w:t xml:space="preserve">• Funciones propias: argumentos con default y ... (dots)</w:t>
+              <w:t xml:space="preserve">• Funciones propias: default, ... (dots), return(), anónimas, ámbito, recursión</w:t>
             </w:r>
           </w:p>
           <w:p>
@@ -1109,6 +1122,19 @@
               <w:t xml:space="preserve">• dplyr: filter, select, mutate, arrange</w:t>
             </w:r>
           </w:p>
+          <w:p>
+            <w:pPr>
+              <w:spacing w:after="40"/>
+            </w:pPr>
+            <w:r>
+              <w:rPr>
+                <w:rFonts w:ascii="Calibri" w:cs="Calibri" w:eastAsia="Calibri" w:hAnsi="Calibri"/>
+                <w:sz w:val="20"/>
+                <w:szCs w:val="20"/>
+              </w:rPr>
+              <w:t xml:space="preserve">• Manejo de cadenas con stringr (str_detect, str_replace, str_split...)</w:t>
+            </w:r>
+          </w:p>
         </w:tc>
       </w:tr>
       <w:tr>
@@ -1394,6 +1420,19 @@
                 <w:szCs w:val="20"/>
               </w:rPr>
               <w:t xml:space="preserve">• Simulación Monte Carlo: ley de grandes números y TLC</w:t>
+            </w:r>
+          </w:p>
+          <w:p>
+            <w:pPr>
+              <w:spacing w:after="40"/>
+            </w:pPr>
+            <w:r>
+              <w:rPr>
+                <w:rFonts w:ascii="Calibri" w:cs="Calibri" w:eastAsia="Calibri" w:hAnsi="Calibri"/>
+                <w:sz w:val="20"/>
+                <w:szCs w:val="20"/>
+              </w:rPr>
+              <w:t xml:space="preserve">• Generar datasets ficticios (fechas, categorías, IDs)</w:t>
             </w:r>
           </w:p>
         </w:tc>

</xml_diff>

<commit_message>
Agrega estadística descriptiva (quantile/IQR/cor/cov) e introducción a inferencia (t.test) a la sesión 6
</commit_message>
<xml_diff>
--- a/docs/Silabo_Curso_R_CIMAT.docx
+++ b/docs/Silabo_Curso_R_CIMAT.docx
@@ -1433,6 +1433,32 @@
                 <w:szCs w:val="20"/>
               </w:rPr>
               <w:t xml:space="preserve">• Generar datasets ficticios (fechas, categorías, IDs)</w:t>
+            </w:r>
+          </w:p>
+          <w:p>
+            <w:pPr>
+              <w:spacing w:after="40"/>
+            </w:pPr>
+            <w:r>
+              <w:rPr>
+                <w:rFonts w:ascii="Calibri" w:cs="Calibri" w:eastAsia="Calibri" w:hAnsi="Calibri"/>
+                <w:sz w:val="20"/>
+                <w:szCs w:val="20"/>
+              </w:rPr>
+              <w:t xml:space="preserve">• Estadística descriptiva (quantile, IQR, cor, cov)</w:t>
+            </w:r>
+          </w:p>
+          <w:p>
+            <w:pPr>
+              <w:spacing w:after="40"/>
+            </w:pPr>
+            <w:r>
+              <w:rPr>
+                <w:rFonts w:ascii="Calibri" w:cs="Calibri" w:eastAsia="Calibri" w:hAnsi="Calibri"/>
+                <w:sz w:val="20"/>
+                <w:szCs w:val="20"/>
+              </w:rPr>
+              <w:t xml:space="preserve">• Introducción a inferencia con t.test()</w:t>
             </w:r>
           </w:p>
         </w:tc>

</xml_diff>

<commit_message>
Agrega librerías básicas nuevas: readxl y lubridate (sesión 3), skimr (sesión 6)
</commit_message>
<xml_diff>
--- a/docs/Silabo_Curso_R_CIMAT.docx
+++ b/docs/Silabo_Curso_R_CIMAT.docx
@@ -1093,7 +1093,7 @@
                 <w:sz w:val="20"/>
                 <w:szCs w:val="20"/>
               </w:rPr>
-              <w:t xml:space="preserve">• data.frame vs. tibble; importación con readr</w:t>
+              <w:t xml:space="preserve">• data.frame vs. tibble; importación con readr/readxl</w:t>
             </w:r>
           </w:p>
           <w:p>
@@ -1133,6 +1133,19 @@
                 <w:szCs w:val="20"/>
               </w:rPr>
               <w:t xml:space="preserve">• Manejo de cadenas con stringr (str_detect, str_replace, str_split...)</w:t>
+            </w:r>
+          </w:p>
+          <w:p>
+            <w:pPr>
+              <w:spacing w:after="40"/>
+            </w:pPr>
+            <w:r>
+              <w:rPr>
+                <w:rFonts w:ascii="Calibri" w:cs="Calibri" w:eastAsia="Calibri" w:hAnsi="Calibri"/>
+                <w:sz w:val="20"/>
+                <w:szCs w:val="20"/>
+              </w:rPr>
+              <w:t xml:space="preserve">• Fechas con lubridate (ymd, wday, floor_date)</w:t>
             </w:r>
           </w:p>
         </w:tc>
@@ -1445,7 +1458,7 @@
                 <w:sz w:val="20"/>
                 <w:szCs w:val="20"/>
               </w:rPr>
-              <w:t xml:space="preserve">• Estadística descriptiva (quantile, IQR, cor, cov)</w:t>
+              <w:t xml:space="preserve">• Estadística descriptiva (quantile, IQR, cor, cov, skimr::skim())</w:t>
             </w:r>
           </w:p>
           <w:p>
@@ -1998,7 +2011,7 @@
         <w:rPr>
           <w:rFonts w:ascii="Calibri" w:cs="Calibri" w:eastAsia="Calibri" w:hAnsi="Calibri"/>
         </w:rPr>
-        <w:t xml:space="preserve">Paquetes: tidyverse, broom, car, quarto (o rmarkdown).</w:t>
+        <w:t xml:space="preserve">Paquetes: tidyverse (readr, dplyr, tidyr, ggplot2, stringr, lubridate...), readxl, skimr, broom, car, quarto (o rmarkdown).</w:t>
       </w:r>
     </w:p>
     <w:p>

</xml_diff>

<commit_message>
Recorta redundancia entre sesión 0 y sesión 1: sesión 1 ya no repite asignación básica, class(), c() ni indexación básica
</commit_message>
<xml_diff>
--- a/docs/Silabo_Curso_R_CIMAT.docx
+++ b/docs/Silabo_Curso_R_CIMAT.docx
@@ -605,20 +605,46 @@
                 <w:sz w:val="20"/>
                 <w:szCs w:val="20"/>
               </w:rPr>
-              <w:t xml:space="preserve">• Consola, scripts, RStudio/Posit y proyectos (.Rproj)</w:t>
-            </w:r>
-          </w:p>
-          <w:p>
-            <w:pPr>
-              <w:spacing w:after="40"/>
-            </w:pPr>
-            <w:r>
-              <w:rPr>
-                <w:rFonts w:ascii="Calibri" w:cs="Calibri" w:eastAsia="Calibri" w:hAnsi="Calibri"/>
-                <w:sz w:val="20"/>
-                <w:szCs w:val="20"/>
-              </w:rPr>
-              <w:t xml:space="preserve">• Tipos de datos y vectores; indexación desde 1 y reciclaje</w:t>
+              <w:t xml:space="preserve">• Todo es función (operadores)</w:t>
+            </w:r>
+          </w:p>
+          <w:p>
+            <w:pPr>
+              <w:spacing w:after="40"/>
+            </w:pPr>
+            <w:r>
+              <w:rPr>
+                <w:rFonts w:ascii="Calibri" w:cs="Calibri" w:eastAsia="Calibri" w:hAnsi="Calibri"/>
+                <w:sz w:val="20"/>
+                <w:szCs w:val="20"/>
+              </w:rPr>
+              <w:t xml:space="preserve">• typeof() y tipos atómicos (integer vs. double, complex)</w:t>
+            </w:r>
+          </w:p>
+          <w:p>
+            <w:pPr>
+              <w:spacing w:after="40"/>
+            </w:pPr>
+            <w:r>
+              <w:rPr>
+                <w:rFonts w:ascii="Calibri" w:cs="Calibri" w:eastAsia="Calibri" w:hAnsi="Calibri"/>
+                <w:sz w:val="20"/>
+                <w:szCs w:val="20"/>
+              </w:rPr>
+              <w:t xml:space="preserve">• Vectores: no hay escalares, coerción</w:t>
+            </w:r>
+          </w:p>
+          <w:p>
+            <w:pPr>
+              <w:spacing w:after="40"/>
+            </w:pPr>
+            <w:r>
+              <w:rPr>
+                <w:rFonts w:ascii="Calibri" w:cs="Calibri" w:eastAsia="Calibri" w:hAnsi="Calibri"/>
+                <w:sz w:val="20"/>
+                <w:szCs w:val="20"/>
+              </w:rPr>
+              <w:t xml:space="preserve">• Indexación: v[-1], which()</w:t>
             </w:r>
           </w:p>
           <w:p>

</xml_diff>